<commit_message>
Add supervisor inline signing, fillable Pre-Employment form, and dynamic policy list
- Supervisor/admin can now sign Worker Declarations inline in Nexus Core
  before it's sent: prepareMasterDocument bakes org-signer fields into the
  PDF via fillCustomFormFromLayout and excludes them from the envelope,
  mirroring the existing custom form_templates pattern.
- Extend the native signing engine so signing_layout 'text' fields can be
  marked `fillable: true` and become real interactive text boxes for the
  signer, instead of always being treated as pre-filled server-side. Used
  to make the Pre-Employment Collection Form's ~30 fields (name, address,
  licence number, qualifications, etc.) and checkboxes genuinely fillable.
- Worker Declarations' policy list now renders via a docxtemplater loop
  populated from the actual documents selected for that send, instead of
  a static ~24-item list.

Co-Authored-By: Claude Sonnet 5 <noreply@anthropic.com>
</commit_message>
<xml_diff>
--- a/server/templates/library/pre-employment-collection-form/template.docx
+++ b/server/templates/library/pre-employment-collection-form/template.docx
@@ -359,7 +359,7 @@
                 <w:b w:val="1"/>
                 <w:rtl w:val="0"/>
               </w:rPr>
-              <w:t>Residential Address {staff.address}</w:t>
+              <w:t>Residential Address</w:t>
             </w:r>
           </w:p>
         </w:tc>
@@ -524,7 +524,7 @@
                 <w:b w:val="1"/>
                 <w:rtl w:val="0"/>
               </w:rPr>
-              <w:t>E-mail address: {staff.email}</w:t>
+              <w:t>E-mail address:</w:t>
             </w:r>
           </w:p>
         </w:tc>
@@ -671,7 +671,7 @@
                 <w:b w:val="1"/>
                 <w:rtl w:val="0"/>
               </w:rPr>
-              <w:t>Mobile Ph: {staff.phone}</w:t>
+              <w:t>Mobile Ph:</w:t>
             </w:r>
           </w:p>
         </w:tc>

</xml_diff>